<commit_message>
Updated stuff - some are binary others human readable
</commit_message>
<xml_diff>
--- a/methods/example-SOP.docx
+++ b/methods/example-SOP.docx
@@ -5,6 +5,11 @@
     <w:p>
       <w:r>
         <w:t>An example “SOP” file for learning how to use Git and GitHub</w:t>
+      </w:r>
+    </w:p>
+    <w:p>
+      <w:r>
+        <w:t>Lets make a change</w:t>
       </w:r>
     </w:p>
     <w:sectPr>

</xml_diff>